<commit_message>
SOP: tighten §1.1; name the micro-USB data cable in §4
Co-Authored-By: Claude Opus 5.5 <noreply@anthropic.com>
Claude-Session: https://claude.ai/code/session_01Ue3sWJSFRo3Bxhe8SfexR3
</commit_message>
<xml_diff>
--- a/docs/SOP_Build_and_Use.docx
+++ b/docs/SOP_Build_and_Use.docx
@@ -468,7 +468,7 @@
         <w:pStyle w:val="FirstParagraph"/>
       </w:pPr>
       <w:r>
-        <w:t xml:space="preserve">The most important thing to understand before using the logger: every time it is powered on, it decides what to do from what happened last time (Figure 1).</w:t>
+        <w:t xml:space="preserve">What the logger does when it is powered on depends on its current state (Figure 1).</w:t>
       </w:r>
     </w:p>
     <w:p>
@@ -480,7 +480,7 @@
           <wp:inline>
             <wp:extent cx="5334000" cy="3200400"/>
             <wp:effectExtent b="0" l="0" r="0" t="0"/>
-            <wp:docPr descr="Figure 1. The logger’s states and what triggers each change. The app can connect only in states 1 and 4; in state 2 the board is powered down. Every timestamp is counted from the power-on that starts data collection, so that must happen at the start time entered in the app." title="" id="21" name="Picture"/>
+            <wp:docPr descr="Figure 1. The logger’s states and what triggers each change." title="" id="21" name="Picture"/>
             <a:graphic>
               <a:graphicData uri="http://schemas.openxmlformats.org/drawingml/2006/picture">
                 <pic:pic>
@@ -523,7 +523,7 @@
         <w:pStyle w:val="ImageCaption"/>
       </w:pPr>
       <w:r>
-        <w:t xml:space="preserve">Figure 1. The logger’s states and what triggers each change. The app can connect only in states 1 and 4; in state 2 the board is powered down. Every timestamp is counted from the power-on that starts data collection, so that must happen at the start time entered in the app.</w:t>
+        <w:t xml:space="preserve">Figure 1. The logger’s states and what triggers each change.</w:t>
       </w:r>
     </w:p>
     <w:tbl>
@@ -601,7 +601,7 @@
                 <w:b/>
                 <w:sz w:val="19"/>
               </w:rPr>
-              <w:t xml:space="preserve">Can the app see it?</w:t>
+              <w:t xml:space="preserve">Visible to the app?</w:t>
             </w:r>
           </w:p>
         </w:tc>
@@ -619,7 +619,7 @@
                 <w:b/>
                 <w:sz w:val="19"/>
               </w:rPr>
-              <w:t xml:space="preserve">How it gets there</w:t>
+              <w:t xml:space="preserve">Reached by</w:t>
             </w:r>
           </w:p>
         </w:tc>
@@ -681,7 +681,7 @@
               <w:rPr>
                 <w:sz w:val="19"/>
               </w:rPr>
-              <w:t xml:space="preserve">Freshly flashed board</w:t>
+              <w:t xml:space="preserve">Flashing the firmware</w:t>
             </w:r>
           </w:p>
         </w:tc>
@@ -743,7 +743,7 @@
               <w:rPr>
                 <w:sz w:val="19"/>
               </w:rPr>
-              <w:t xml:space="preserve">Initialize in the app (from state 1 or 4)</w:t>
+              <w:t xml:space="preserve">Initialize in the app, from state 1 or 4</w:t>
             </w:r>
           </w:p>
         </w:tc>
@@ -775,7 +775,7 @@
               <w:rPr>
                 <w:sz w:val="19"/>
               </w:rPr>
-              <w:t xml:space="preserve">Off (briefly on at power-on)</w:t>
+              <w:t xml:space="preserve">Brief flash at power-on, then off</w:t>
             </w:r>
           </w:p>
         </w:tc>
@@ -805,7 +805,7 @@
               <w:rPr>
                 <w:sz w:val="19"/>
               </w:rPr>
-              <w:t xml:space="preserve">Powered on after Initialize</w:t>
+              <w:t xml:space="preserve">Powering on after Initialize</w:t>
             </w:r>
           </w:p>
         </w:tc>
@@ -867,7 +867,7 @@
               <w:rPr>
                 <w:sz w:val="19"/>
               </w:rPr>
-              <w:t xml:space="preserve">Power-cycle, or any reset, during collection</w:t>
+              <w:t xml:space="preserve">A power-cycle or any reset during data collection</w:t>
             </w:r>
           </w:p>
         </w:tc>
@@ -878,7 +878,7 @@
         <w:pStyle w:val="BodyText"/>
       </w:pPr>
       <w:r>
-        <w:t xml:space="preserve">What this means in practice:</w:t>
+        <w:t xml:space="preserve">Keep in mind:</w:t>
       </w:r>
     </w:p>
     <w:p>
@@ -890,20 +890,29 @@
         <w:pStyle w:val="Compact"/>
       </w:pPr>
       <w:r>
-        <w:t xml:space="preserve">A logger that is collecting data</w:t>
-      </w:r>
-      <w:r>
-        <w:t xml:space="preserve"> </w:t>
-      </w:r>
+        <w:t xml:space="preserve">The app cannot see a logger that is collecting data. Power-cycle it first to reach state 4.</w:t>
+      </w:r>
+    </w:p>
+    <w:p>
+      <w:pPr>
+        <w:numPr>
+          <w:ilvl w:val="0"/>
+          <w:numId w:val="1002"/>
+        </w:numPr>
+        <w:pStyle w:val="Compact"/>
+      </w:pPr>
       <w:r>
         <w:rPr>
           <w:bCs/>
           <w:b/>
         </w:rPr>
-        <w:t xml:space="preserve">cannot be found by the app</w:t>
-      </w:r>
-      <w:r>
-        <w:t xml:space="preserve">. Power-cycle it once to reach state 4, then connect.</w:t>
+        <w:t xml:space="preserve">Any reset or power loss</w:t>
+      </w:r>
+      <w:r>
+        <w:t xml:space="preserve"> </w:t>
+      </w:r>
+      <w:r>
+        <w:t xml:space="preserve">during a deployment, such as a loose coin cell, ends the recording for good.</w:t>
       </w:r>
     </w:p>
     <w:p>
@@ -914,18 +923,21 @@
         </w:numPr>
         <w:pStyle w:val="Compact"/>
       </w:pPr>
+      <w:r>
+        <w:t xml:space="preserve">Initializing</w:t>
+      </w:r>
+      <w:r>
+        <w:t xml:space="preserve"> </w:t>
+      </w:r>
       <w:r>
         <w:rPr>
           <w:bCs/>
           <w:b/>
         </w:rPr>
-        <w:t xml:space="preserve">Any reset or power interruption</w:t>
-      </w:r>
-      <w:r>
-        <w:t xml:space="preserve"> </w:t>
-      </w:r>
-      <w:r>
-        <w:t xml:space="preserve">during a deployment (a loose battery, a knock on the reset button) ends the recording. The logger goes to idle and does not resume data collection.</w:t>
+        <w:t xml:space="preserve">erases the previous recording</w:t>
+      </w:r>
+      <w:r>
+        <w:t xml:space="preserve">, so download it first (§7).</w:t>
       </w:r>
     </w:p>
     <w:p>
@@ -937,20 +949,7 @@
         <w:pStyle w:val="Compact"/>
       </w:pPr>
       <w:r>
-        <w:t xml:space="preserve">Initializing (state 4 → 2)</w:t>
-      </w:r>
-      <w:r>
-        <w:t xml:space="preserve"> </w:t>
-      </w:r>
-      <w:r>
-        <w:rPr>
-          <w:bCs/>
-          <w:b/>
-        </w:rPr>
-        <w:t xml:space="preserve">erases the previous recording</w:t>
-      </w:r>
-      <w:r>
-        <w:t xml:space="preserve">. Ensure that you have downloaded the existing data first.</w:t>
+        <w:t xml:space="preserve">Timestamps count from the power-on that starts data collection, so power on at the start time entered in the app (§5).</w:t>
       </w:r>
     </w:p>
     <w:p>
@@ -3535,7 +3534,7 @@
         <w:pStyle w:val="Compact"/>
       </w:pPr>
       <w:r>
-        <w:t xml:space="preserve">☐ A USB data cable is at hand, and the Arduino Serial Monitor (or anything else using the logger’s port) is closed.</w:t>
+        <w:t xml:space="preserve">☐ A micro-USB data cable is at hand, and the Arduino Serial Monitor (or anything else using the logger’s port) is closed.</w:t>
       </w:r>
     </w:p>
     <w:p>

</xml_diff>